<commit_message>
Fiche IC : retrait de la ligne Date vide sous les signatures (deja en haut)
</commit_message>
<xml_diff>
--- a/complet/modeles/Fiche_IC_CSPS17_v17.docx
+++ b/complet/modeles/Fiche_IC_CSPS17_v17.docx
@@ -11437,25 +11437,6 @@
             <w:pPr>
               <w:keepNext/>
             </w:pPr>
-          </w:p>
-          <w:p>
-            <w:pPr>
-              <w:keepNext/>
-            </w:pPr>
-            <w:r>
-              <w:rPr>
-                <w:rFonts w:ascii="Arial" w:eastAsia="Arial" w:hAnsi="Arial" w:cs="Arial"/>
-                <w:color w:val="000000"/>
-                <w:sz w:val="16"/>
-                <w:szCs w:val="16"/>
-              </w:rPr>
-              <w:t>Date : _____ / _____ / _______</w:t>
-            </w:r>
-          </w:p>
-          <w:p>
-            <w:pPr>
-              <w:keepNext/>
-            </w:pPr>
             <w:r>
               <w:rPr>
                 <w:rFonts w:ascii="Arial" w:eastAsia="Arial" w:hAnsi="Arial" w:cs="Arial"/>
@@ -11546,25 +11527,6 @@
               <w:keepNext/>
             </w:pPr>
           </w:p>
-          <w:p>
-            <w:pPr>
-              <w:keepNext/>
-            </w:pPr>
-          </w:p>
-          <w:p>
-            <w:pPr>
-              <w:keepNext/>
-            </w:pPr>
-            <w:r>
-              <w:rPr>
-                <w:rFonts w:ascii="Arial" w:eastAsia="Arial" w:hAnsi="Arial" w:cs="Arial"/>
-                <w:color w:val="000000"/>
-                <w:sz w:val="16"/>
-                <w:szCs w:val="16"/>
-              </w:rPr>
-              <w:t>Date : _____ / _____ / _______</w:t>
-            </w:r>
-          </w:p>
         </w:tc>
       </w:tr>
       <w:tr>
@@ -11612,17 +11574,6 @@
                 <w:szCs w:val="16"/>
               </w:rPr>
               <w:t>Nom : Qualité : Signature :</w:t>
-            </w:r>
-          </w:p>
-          <w:p>
-            <w:r>
-              <w:rPr>
-                <w:rFonts w:ascii="Arial" w:eastAsia="Arial" w:hAnsi="Arial" w:cs="Arial"/>
-                <w:color w:val="000000"/>
-                <w:sz w:val="16"/>
-                <w:szCs w:val="16"/>
-              </w:rPr>
-              <w:t>Date : _____ / _____ / _______</w:t>
             </w:r>
           </w:p>
         </w:tc>

</xml_diff>